<commit_message>
Components, Props, Start the Chatbot Project
</commit_message>
<xml_diff>
--- a/health insurance/Health insurance faq.docx
+++ b/health insurance/Health insurance faq.docx
@@ -14,7 +14,15 @@
     </w:p>
     <w:p>
       <w:r>
-        <w:t>Policies with no sublimit for any particular diseases to be taken</w:t>
+        <w:t xml:space="preserve">Policies with no sublimit for any </w:t>
+      </w:r>
+      <w:proofErr w:type="gramStart"/>
+      <w:r>
+        <w:t>particular diseases</w:t>
+      </w:r>
+      <w:proofErr w:type="gramEnd"/>
+      <w:r>
+        <w:t xml:space="preserve"> to be taken</w:t>
       </w:r>
     </w:p>
     <w:p>
@@ -24,29 +32,33 @@
     </w:p>
     <w:p>
       <w:r>
-        <w:t>Policies with pre hospitalization and post hospitalization fully covered to be taken</w:t>
-      </w:r>
-    </w:p>
-    <w:p>
-      <w:r>
-        <w:t>Pre hospitalization (min 60 days and max 180 days)covers scanning, blood tests etc</w:t>
-      </w:r>
-    </w:p>
-    <w:p>
-      <w:r>
-        <w:t xml:space="preserve">Post hospitalization </w:t>
-      </w:r>
-      <w:r>
-        <w:t>(min 60 days</w:t>
-      </w:r>
-      <w:r>
-        <w:t xml:space="preserve"> </w:t>
-      </w:r>
-      <w:r>
-        <w:t>and max 180 days)</w:t>
-      </w:r>
-      <w:r>
-        <w:t xml:space="preserve"> includes medicines, follow up, scanning etc after treatment</w:t>
+        <w:t xml:space="preserve">Policies with </w:t>
+      </w:r>
+      <w:proofErr w:type="gramStart"/>
+      <w:r>
+        <w:t>pre hospitalization</w:t>
+      </w:r>
+      <w:proofErr w:type="gramEnd"/>
+      <w:r>
+        <w:t xml:space="preserve"> and post hospitalization fully covered to be taken</w:t>
+      </w:r>
+    </w:p>
+    <w:p>
+      <w:r>
+        <w:t xml:space="preserve">Pre hospitalization (min 60 days and max 180 </w:t>
+      </w:r>
+      <w:proofErr w:type="gramStart"/>
+      <w:r>
+        <w:t>days)covers</w:t>
+      </w:r>
+      <w:proofErr w:type="gramEnd"/>
+      <w:r>
+        <w:t xml:space="preserve"> scanning, blood tests etc</w:t>
+      </w:r>
+    </w:p>
+    <w:p>
+      <w:r>
+        <w:t>Post hospitalization (min 60 days and max 180 days) includes medicines, follow up, scanning etc after treatment</w:t>
       </w:r>
     </w:p>
     <w:p>
@@ -123,6 +135,81 @@
       <w:proofErr w:type="spellEnd"/>
       <w:r>
         <w:t xml:space="preserve"> issues </w:t>
+      </w:r>
+    </w:p>
+    <w:p>
+      <w:r>
+        <w:t xml:space="preserve">Incurred claims ratio </w:t>
+      </w:r>
+      <w:proofErr w:type="spellStart"/>
+      <w:r>
+        <w:t>tonbe</w:t>
+      </w:r>
+      <w:proofErr w:type="spellEnd"/>
+      <w:r>
+        <w:t xml:space="preserve"> between 80-85 percent... More is dangerous, less is dangerous </w:t>
+      </w:r>
+    </w:p>
+    <w:p/>
+    <w:p>
+      <w:r>
+        <w:t>Complaints per 10000 claims to be less than 22</w:t>
+      </w:r>
+    </w:p>
+    <w:p>
+      <w:r>
+        <w:t>Doubt on how to identify the existing illness</w:t>
+      </w:r>
+    </w:p>
+    <w:p/>
+    <w:p>
+      <w:r>
+        <w:t>Std Waiting period (30 days)</w:t>
+      </w:r>
+    </w:p>
+    <w:p>
+      <w:proofErr w:type="spellStart"/>
+      <w:proofErr w:type="gramStart"/>
+      <w:r>
+        <w:t>Pre existing</w:t>
+      </w:r>
+      <w:proofErr w:type="spellEnd"/>
+      <w:proofErr w:type="gramEnd"/>
+      <w:r>
+        <w:t xml:space="preserve"> disease waiting period (3. Year)</w:t>
+      </w:r>
+    </w:p>
+    <w:p>
+      <w:r>
+        <w:t xml:space="preserve">Specific disease waiting period </w:t>
+      </w:r>
+    </w:p>
+    <w:p/>
+    <w:p>
+      <w:r>
+        <w:t xml:space="preserve">Day care treatments </w:t>
+      </w:r>
+      <w:proofErr w:type="gramStart"/>
+      <w:r>
+        <w:t>is</w:t>
+      </w:r>
+      <w:proofErr w:type="gramEnd"/>
+      <w:r>
+        <w:t xml:space="preserve"> not equal to </w:t>
+      </w:r>
+      <w:proofErr w:type="spellStart"/>
+      <w:r>
+        <w:t>opd</w:t>
+      </w:r>
+      <w:proofErr w:type="spellEnd"/>
+    </w:p>
+    <w:p/>
+    <w:p>
+      <w:r>
+        <w:t>Restoration benefits to be discussed with example with lawyer</w:t>
+      </w:r>
+      <w:r>
+        <w:t xml:space="preserve"> [how the hierarchy works] </w:t>
       </w:r>
     </w:p>
     <w:p/>

</xml_diff>